<commit_message>
feat: migrate to VNPost remote vLLM models, Qdrant vector store, and uv dependency management
- Remote Models: Connect to VNPost BGE-M3 1024d embedding API and Qwen3-Reranker-8B API
- Vector Store: Sync 1,677 chunks into on-disk Qdrant Vector DB (data/qdrant_db)
- Orchestration: Migrate checkpointing to in-memory MemorySaver
- Sub-agents: Add action agents (booking-agent, complaint-agent, post-office-agent) with HITL
- Packaging: Migrate to native uv package manager with pyproject.toml and uv.lock
- Optimization: Remove heavy local PyTorch/CUDA dependencies and clean up unused code
- Code Quality: Pass 100% ruff linting and 153/153 pytest suite
</commit_message>
<xml_diff>
--- a/docs/Kien_truc_Chatbot_DeepAgent_RAG_ZeroTTS.docx
+++ b/docs/Kien_truc_Chatbot_DeepAgent_RAG_ZeroTTS.docx
@@ -1517,6 +1517,39 @@
           <w:b w:val="0"/>
         </w:rPr>
         <w:t>Kế hoạch phụ thuộc được hướng dẫn bằng prompt. Runtime kiểm soát budget và concurrency, nhưng không tự chứng minh rằng kế hoạch do LLM chọn là tối ưu. Bộ kiểm thử xác nhận cả task chuẩn lẫn dispatcher có các khoảng chạy thực sự chồng nhau.</w:t>
+      </w:r>
+    </w:p>
+    <w:p>
+      <w:pPr>
+        <w:pStyle w:val="Heading2"/>
+      </w:pPr>
+      <w:r>
+        <w:t>Quản lý trạng thái Checkpointer và Kho kỹ năng (/skills/)</w:t>
+      </w:r>
+    </w:p>
+    <w:p>
+      <w:r>
+        <w:t>PersistentSqliteCheckpointer lưu trạng thái đồ thị bất đồng bộ vào checkpoints.sqlite3 với thread ID {tenant}:{session}:{request} phục vụ kiểm toán audit và tái hiện ngữ cảnh phiên.</w:t>
+      </w:r>
+    </w:p>
+    <w:p>
+      <w:r>
+        <w:t>Hàm _load_enterprise_skills() nạp các file .md trong thư mục data/skills/ vào hệ thống file ảo /skills/... của StateBackend để các Sub-agent (rag-agent, analyst-agent, writer-agent) đọc bằng công cụ read_file. 3 bộ kỹ năng nghiệp vụ thực tế bao gồm:</w:t>
+      </w:r>
+    </w:p>
+    <w:p>
+      <w:r>
+        <w:t>• bang_ma_buu_chinh_vung_cuoc: Phân định 3 vùng cước (Vùng 1 nội tỉnh; Vùng 2 nội miền gồm Bắc từ Hà Giang đến Ninh Bình, Trung từ Thanh Hóa đến Bình Định, Nam từ Phú Yên trở vào; Vùng 3 liên miền) và cấu trúc mã bưu chính quốc gia Vpostcode 5 chữ số.</w:t>
+      </w:r>
+    </w:p>
+    <w:p>
+      <w:r>
+        <w:t>• quy_dinh_hang_cong_kenh: Tính khối lượng quy đổi theo chuẩn VNPost và IATA/UPU: Khối lượng quy đổi (kg) = (Dài x Rộng x Cao) / 6000 (cm). Cước tính theo giá trị lớn hơn giữa cân nặng thực tế và khối lượng thể tích quy đổi (chuẩn hóa toàn mạng lưới duy nhất mẫu số 6000, không áp dụng hệ số 5000).</w:t>
+      </w:r>
+    </w:p>
+    <w:p>
+      <w:r>
+        <w:t>• quy_trinh_khieu_nai_boi_thuong: Thời hiệu khiếu nại quy định 06 tháng đối với bưu gửi nội địa và 12 tháng đối với bưu gửi quốc tế kể từ ngày gửi; thời hạn giải quyết tối đa 20 ngày làm việc (nội địa), 30 ngày (quốc tế EMS); bồi thường 100% giá trị khai giá với bưu gửi có khai giá, hoàn cước cộng tối đa 04 lần cước với bưu gửi không khai giá, và hoàn cước khi phát chậm.</w:t>
       </w:r>
     </w:p>
     <w:p>

</xml_diff>